<commit_message>
Progression report: Day 4
Co-Authored-By: Claude Opus 5.5 <noreply@anthropic.com>
</commit_message>
<xml_diff>
--- a/Progression report.docx
+++ b/Progression report.docx
@@ -1030,6 +1030,327 @@
       </w:pPr>
       <w:r>
         <w:t xml:space="preserve">Receiver-side dedup is now possible (webhook-id = event_id on every request) but is, by design, the customer's job — at-least-once delivery, never claimed exactly-once.</w:t>
+      </w:r>
+    </w:p>
+    <w:p/>
+    <w:p>
+      <w:r>
+        <w:rPr>
+          <w:b/>
+          <w:bCs/>
+        </w:rPr>
+        <w:t xml:space="preserve">Day 4:</w:t>
+      </w:r>
+    </w:p>
+    <w:p>
+      <w:r>
+        <w:t xml:space="preserve">Goal for today: put the project under version control, write down the architecture decisions (and find out where the code and the spec actually disagree), then load-test the system to see whether its throughput and isolation claims hold up. As on Day 3, Claude Code did most of the implementation while I directed and reviewed. The probe design in section 3 was my idea.</w:t>
+      </w:r>
+    </w:p>
+    <w:p>
+      <w:r>
+        <w:rPr>
+          <w:b/>
+          <w:bCs/>
+        </w:rPr>
+        <w:t xml:space="preserve">1. Git, and a .gitignore mistake caught before it mattered</w:t>
+      </w:r>
+    </w:p>
+    <w:p>
+      <w:r>
+        <w:t xml:space="preserve">Reliant is now a git repo (in Reliant/, branch main). While staging the first commit, .env showed up as a file to be committed. The original .gitignore had no newline at the end, so appending graphify-out/ glued it onto the .env line, making one pattern (".envgraphify-out/") that matched nothing. It was caught by reading the staged file list before committing, and everything was unstaged and fixed. A secret scan of the staged files, and of the Word report's text, found nothing sensitive. Added .gitattributes so line endings are stored consistently.</w:t>
+      </w:r>
+    </w:p>
+    <w:p>
+      <w:r>
+        <w:rPr>
+          <w:b/>
+          <w:bCs/>
+        </w:rPr>
+        <w:t xml:space="preserve">2. Writing the ADRs exposed a real contradiction with the spec</w:t>
+      </w:r>
+    </w:p>
+    <w:p>
+      <w:r>
+        <w:t xml:space="preserve">Wrote ADRs 001, 002, 004, 005, 007 and 008 in docs/adr/, each with context, decision, consequences and rejected alternatives. 003 (MSK vs self-hosted Kafka) and 006 (autoscaling) are deliberately left undecided until there's a cloud deployment. Two ADRs record where the build differs from the spec:</w:t>
+      </w:r>
+    </w:p>
+    <w:p>
+      <w:pPr>
+        <w:numPr>
+          <w:ilvl w:val="0"/>
+          <w:numId w:val="2"/>
+        </w:numPr>
+      </w:pPr>
+      <w:r>
+        <w:t xml:space="preserve">ADR-002: retries live in a Postgres queue, not the Kafka retry topics the spec chose. The reason goes back to Day 2: retries must not depend on partitions, and Kafka retry topics would be partitioned by tenant too. Accepted.</w:t>
+      </w:r>
+    </w:p>
+    <w:p>
+      <w:pPr>
+        <w:numPr>
+          <w:ilvl w:val="0"/>
+          <w:numId w:val="2"/>
+        </w:numPr>
+      </w:pPr>
+      <w:r>
+        <w:t xml:space="preserve">ADR-008: checking the code against the spec showed that delivery is completion-ordered per endpoint (event N+1 waits until N is delivered or dead), which the spec explicitly rejects. The concrete cost: with the default retry schedule, one event that keeps failing blocks every later event for that endpoint for about 14.6 hours. That's harmless when the whole endpoint is down, but harmful when the endpoint only rejects that one event.</w:t>
+      </w:r>
+    </w:p>
+    <w:p>
+      <w:r>
+        <w:rPr>
+          <w:b/>
+          <w:bCs/>
+        </w:rPr>
+        <w:t xml:space="preserve">3. My fix: ask the endpoint whether it is the problem</w:t>
+      </w:r>
+    </w:p>
+    <w:p>
+      <w:r>
+        <w:t xml:space="preserve">The idea: retry a few times, then send a sample packet. If the sample is delivered, the endpoint is fine and the problem is that event, so skip it and move on. If the sample also fails, the endpoint is the problem, so stay on this event. Implemented with two refinements:</w:t>
+      </w:r>
+    </w:p>
+    <w:p>
+      <w:pPr>
+        <w:numPr>
+          <w:ilvl w:val="0"/>
+          <w:numId w:val="2"/>
+        </w:numPr>
+      </w:pPr>
+      <w:r>
+        <w:t xml:space="preserve">The sample is a dedicated, signed reliant.ping event with an empty payload. Resending a real event as the sample would make the customer process it twice. Receivers are told to answer it with 2xx and ignore it (the README now has a receiver contract). GitHub's webhook ping works the same way.</w:t>
+      </w:r>
+    </w:p>
+    <w:p>
+      <w:pPr>
+        <w:numPr>
+          <w:ilvl w:val="0"/>
+          <w:numId w:val="2"/>
+        </w:numPr>
+      </w:pPr>
+      <w:r>
+        <w:t xml:space="preserve">A skipped event is never dropped. It's dead-lettered with a new reason, payload_rejected (distinct from delivery_exhausted), and can be replayed from the dashboard once the customer fixes their handler.</w:t>
+      </w:r>
+    </w:p>
+    <w:p>
+      <w:r>
+        <w:t xml:space="preserve">The probe runs after the 3rd failed attempt (about 6 minutes in), so the worst-case stall drops from about 14.6 hours to about 6 minutes. A healthy ping also resets the circuit breaker's failure count, so one bad event can no longer open the breaker for a working endpoint. There's a new end-to-end test, and ADR-008 is now Accepted. Known weakness, recorded in the ADR: a receiver that answers pings without checking anything, but whose handler is broken for every event, gets every event set aside after 3 attempts instead of retried. Nothing is lost, but the DLQ fills up, so bulk replay is the natural follow-up.</w:t>
+      </w:r>
+    </w:p>
+    <w:p>
+      <w:r>
+        <w:rPr>
+          <w:b/>
+          <w:bCs/>
+        </w:rPr>
+        <w:t xml:space="preserve">4. Load-test harness</w:t>
+      </w:r>
+    </w:p>
+    <w:p>
+      <w:r>
+        <w:t xml:space="preserve">Built loadtest/run.js with three scenarios from the spec: ingest throughput ramp, endpoint isolation (baseline vs one hanging endpoint per tenant), and backlog recovery. Latency is measured inside Postgres, from events.created_at to the start of the first ledger attempt, so everything uses one clock. Everything runs on one Windows machine, with the databases in Docker, so absolute numbers are lower bounds. The useful part is where the bottlenecks sit.</w:t>
+      </w:r>
+    </w:p>
+    <w:p>
+      <w:r>
+        <w:rPr>
+          <w:b/>
+          <w:bCs/>
+        </w:rPr>
+        <w:t xml:space="preserve">5. Ingest: the obvious suspect was wrong, measuring found the real one</w:t>
+      </w:r>
+    </w:p>
+    <w:p>
+      <w:r>
+        <w:t xml:space="preserve">Ingest topped out at about 725 events/s, below the 1,000/s target. The first hypothesis was the idempotent Kafka producer: a benchmark showed kafkajs handles its sends one at a time (about 1,300/s, whatever the concurrency). So Kafka publishes were batched (group commit), and throughput didn't change at all. Then each step of a request was measured on its own: the real limit was 3 sequential Postgres round trips per request (check the tenant, insert, mark published). Fixed by replacing the tenant lookup with a foreign key that Postgres enforces inside the insert, and by marking a whole Kafka batch published in one UPDATE. One process went to about 950/s and became CPU-bound (one Node process is single-threaded). Running more stateless processes scaled it: 2 processes about 1,290/s, 4 about 1,930/s. Lesson: measure before fixing, because the 'obvious' bottleneck wasn't the binding one.</w:t>
+      </w:r>
+    </w:p>
+    <w:p>
+      <w:r>
+        <w:rPr>
+          <w:b/>
+          <w:bCs/>
+        </w:rPr>
+        <w:t xml:space="preserve">6. Isolation: the claim failed under load, and a timeline explained why</w:t>
+      </w:r>
+    </w:p>
+    <w:p>
+      <w:r>
+        <w:t xml:space="preserve">With one hanging endpoint per tenant, healthy endpoints' p95 went from 42ms to about 5.2 seconds, a clear fail against the spec. A per-5-second timeline showed it was a startup transient, not steady state: each tenant's first event to the broken endpoint blocks its Kafka partition for the full 3-second inline timeout. After that, a pending row exists and later events queue behind it, so latency returns to baseline after about 20 seconds. Two of the three test tenants turned out to share a partition, so they paid for each other's stall. That's Day 2's partition-collision point, measured again.</w:t>
+      </w:r>
+    </w:p>
+    <w:p>
+      <w:r>
+        <w:rPr>
+          <w:b/>
+          <w:bCs/>
+        </w:rPr>
+        <w:t xml:space="preserve">7. Recovery: the consumer, not ingest, was the real limit</w:t>
+      </w:r>
+    </w:p>
+    <w:p>
+      <w:r>
+        <w:t xml:space="preserve">Backlog drain ran at about 180 events/s against a target of about 2,000/s, roughly 10 times short. The consumer processed one message at a time per partition, with about 6 sequential database and Redis round trips each, which capped the whole pipeline near 340/s. It couldn't even keep up with the 1,000/s ingest baseline.</w:t>
+      </w:r>
+    </w:p>
+    <w:p>
+      <w:r>
+        <w:rPr>
+          <w:b/>
+          <w:bCs/>
+        </w:rPr>
+        <w:t xml:space="preserve">8. Bugs the load tests found</w:t>
+      </w:r>
+    </w:p>
+    <w:p>
+      <w:pPr>
+        <w:numPr>
+          <w:ilvl w:val="0"/>
+          <w:numId w:val="2"/>
+        </w:numPr>
+      </w:pPr>
+      <w:r>
+        <w:t xml:space="preserve">A Kafka message whose events row was missing failed the ledger's foreign key, and kafkajs retried it forever: a permanent partition stall. Nothing deletes events today, but the retention job from ADR-001 would have triggered it. The consumer now checks the archive row in the same query and sends such messages to the DLQ topic.</w:t>
+      </w:r>
+    </w:p>
+    <w:p>
+      <w:pPr>
+        <w:numPr>
+          <w:ilvl w:val="0"/>
+          <w:numId w:val="2"/>
+        </w:numPr>
+      </w:pPr>
+      <w:r>
+        <w:t xml:space="preserve">Harness bugs, also fixed: leftover Kafka backlog from the ingest ramp mixing into later tests (the harness now refuses to start if there's lag), and an offset reset that commits -1, which a fromBeginning consumer reads as 'start from the beginning' and would have re-read about 400k messages. Caught before the consumer was started. Plus an off-by-one in the recovery target.</w:t>
+      </w:r>
+    </w:p>
+    <w:p>
+      <w:r>
+        <w:rPr>
+          <w:b/>
+          <w:bCs/>
+        </w:rPr>
+        <w:t xml:space="preserve">9. The batched consumer</w:t>
+      </w:r>
+    </w:p>
+    <w:p>
+      <w:r>
+        <w:t xml:space="preserve">Switched the consumer from eachMessage to eachBatch, processing chunks of up to 200 messages. The bookkeeping is now done once per chunk: one query each for the archive check, endpoints and pending rows, one Redis MGET for breakers, one multi-row insert each for the ledger and the retry queue, and breaker writes only for states that changed. All the correctness rules are kept: an endpoint's events in a chunk are attempted strictly in order, and everything after a failure or an earlier pending row is queued behind it. A chunk's offset is resolved only after its writes succeed. Added a 3-second budget per endpoint per chunk, so a slow endpoint can't hold a partition for N × timeout, and cached decrypted signing secrets, because decrypting them per event was measurable CPU. New test: a burst queued behind a failure is delivered in exactly its acceptance order.</w:t>
+      </w:r>
+    </w:p>
+    <w:p>
+      <w:pPr>
+        <w:numPr>
+          <w:ilvl w:val="0"/>
+          <w:numId w:val="2"/>
+        </w:numPr>
+      </w:pPr>
+      <w:r>
+        <w:t xml:space="preserve">Drain rate: about 180/s before; about 800–960/s with one consumer; about 1,500–1,780/s peak with 3 consumers. Still short of 2,000/s: one consumer is now CPU-bound, and the uneven spread of tenants over only 3 partitions leaves one consumer working alone at the end of a drain.</w:t>
+      </w:r>
+    </w:p>
+    <w:p>
+      <w:pPr>
+        <w:numPr>
+          <w:ilvl w:val="0"/>
+          <w:numId w:val="2"/>
+        </w:numPr>
+      </w:pPr>
+      <w:r>
+        <w:t xml:space="preserve">Isolation: the startup transient now lasts about 10s instead of about 20s, and median latency with a hanging endpoint went from 1,048ms back to 35ms. The first 3-second timeout against a newly broken endpoint still holds up its partition.</w:t>
+      </w:r>
+    </w:p>
+    <w:p>
+      <w:pPr>
+        <w:numPr>
+          <w:ilvl w:val="0"/>
+          <w:numId w:val="2"/>
+        </w:numPr>
+      </w:pPr>
+      <w:r>
+        <w:t xml:space="preserve">Trade-offs, recorded in ADR-005: a crash can now redeliver up to a whole chunk instead of one message, and baseline p95 rose from 42ms to 86ms.</w:t>
+      </w:r>
+    </w:p>
+    <w:p>
+      <w:r>
+        <w:rPr>
+          <w:b/>
+          <w:bCs/>
+        </w:rPr>
+        <w:t xml:space="preserve">10. Decision: stop load testing for now</w:t>
+      </w:r>
+    </w:p>
+    <w:p>
+      <w:r>
+        <w:t xml:space="preserve">The later load-test runs took 1–15 minutes each, and chasing throughput numbers isn't what this phase is for: the project is still being built. Load tests will run again when there's a specific change to measure. Normal development uses only the unit and integration tests (about 1–2 minutes).</w:t>
+      </w:r>
+    </w:p>
+    <w:p>
+      <w:r>
+        <w:rPr>
+          <w:b/>
+          <w:bCs/>
+        </w:rPr>
+        <w:t xml:space="preserve">11. End-of-day state</w:t>
+      </w:r>
+    </w:p>
+    <w:p>
+      <w:r>
+        <w:t xml:space="preserve">8 commits in git. 21 tests passing: 9 core unit tests, 4 tenant-isolation tests, and 8 end-to-end pipeline tests. New today: docs/adr/ (6 ADRs + index), docs/load-test-results.md, loadtest/run.js, the endpoint ping and payload_rejected dead-lettering, and the batched consumer.</w:t>
+      </w:r>
+    </w:p>
+    <w:p>
+      <w:r>
+        <w:rPr>
+          <w:b/>
+          <w:bCs/>
+        </w:rPr>
+        <w:t xml:space="preserve">12. What's left</w:t>
+      </w:r>
+    </w:p>
+    <w:p>
+      <w:pPr>
+        <w:numPr>
+          <w:ilvl w:val="0"/>
+          <w:numId w:val="2"/>
+        </w:numPr>
+      </w:pPr>
+      <w:r>
+        <w:t xml:space="preserve">Push to GitHub (the repo needs creating first).</w:t>
+      </w:r>
+    </w:p>
+    <w:p>
+      <w:pPr>
+        <w:numPr>
+          <w:ilvl w:val="0"/>
+          <w:numId w:val="2"/>
+        </w:numPr>
+      </w:pPr>
+      <w:r>
+        <w:t xml:space="preserve">Bulk replay of payload_rejected events; the first-failure stall (cheapest fix: a 1-second inline timeout); more Kafka partitions (3 → 12, changed while nothing is waiting to be consumed); a retention job for events and the ledger.</w:t>
+      </w:r>
+    </w:p>
+    <w:p>
+      <w:pPr>
+        <w:numPr>
+          <w:ilvl w:val="0"/>
+          <w:numId w:val="2"/>
+        </w:numPr>
+      </w:pPr>
+      <w:r>
+        <w:t xml:space="preserve">Known gaps still open: the DNS-rebinding window in the SSRF check, a race in circuit-breaker counting, rate limiting by fixed one-second window rather than token bucket, global (not per-tenant) retry policies, graceful shutdown never verified.</w:t>
+      </w:r>
+    </w:p>
+    <w:p>
+      <w:pPr>
+        <w:numPr>
+          <w:ilvl w:val="0"/>
+          <w:numId w:val="2"/>
+        </w:numPr>
+      </w:pPr>
+      <w:r>
+        <w:t xml:space="preserve">Phase 4: CI (GitHub Actions), observability (/metrics, logs tagged with event_id, tracing), Docker and Kubernetes, Terraform and AWS, and one induced-failure postmortem.</w:t>
       </w:r>
     </w:p>
     <w:sectPr>

</xml_diff>

<commit_message>
Add KEDA autoscaling for consumer and worker (ADR-006)
Consumer scales on Kafka lag (500/replica, max 12), worker on endpoints
with due retries (50/replica, max 10), 2-minute scale-down window.
Verified locally: consumer 1 -> 4 -> 1 under a capped-CPU backlog.

Fixes found on the way: FQDN service names (KEDA runs in another
namespace), Postgres decoupled from the app ConfigMap so config changes
don't wipe it, migrate Job self-deletes so re-apply re-runs it, and no
replicas field on autoscaled Deployments. Day 5 added to the report.

Co-Authored-By: Claude Opus 5.5 <noreply@anthropic.com>
</commit_message>
<xml_diff>
--- a/Progression report.docx
+++ b/Progression report.docx
@@ -1351,6 +1351,386 @@
       </w:pPr>
       <w:r>
         <w:t xml:space="preserve">Phase 4: CI (GitHub Actions), observability (/metrics, logs tagged with event_id, tracing), Docker and Kubernetes, Terraform and AWS, and one induced-failure postmortem.</w:t>
+      </w:r>
+    </w:p>
+    <w:p/>
+    <w:p>
+      <w:r>
+        <w:rPr>
+          <w:b/>
+          <w:bCs/>
+        </w:rPr>
+        <w:t xml:space="preserve">Day 5:</w:t>
+      </w:r>
+    </w:p>
+    <w:p>
+      <w:r>
+        <w:t xml:space="preserve">Goal for today: finish the open items from Day 4, then start Phase 4 (production infrastructure): CI, observability, containers and Kubernetes, and autoscaling. As before, Claude Code did most of the implementation while I directed and reviewed. Every item was checked against the real running stack, not just by tests, and that's where most of today's bugs were found.</w:t>
+      </w:r>
+    </w:p>
+    <w:p>
+      <w:r>
+        <w:rPr>
+          <w:b/>
+          <w:bCs/>
+        </w:rPr>
+        <w:t xml:space="preserve">1. Day 4 leftovers</w:t>
+      </w:r>
+    </w:p>
+    <w:p>
+      <w:pPr>
+        <w:numPr>
+          <w:ilvl w:val="0"/>
+          <w:numId w:val="2"/>
+        </w:numPr>
+      </w:pPr>
+      <w:r>
+        <w:t xml:space="preserve">Bulk replay: an endpoint's whole DLQ (optionally only one reason, e.g. payload_rejected) can be re-queued in its original order from the dashboard. It's for the case where a customer fixes a handler bug that caused a run of rejected events.</w:t>
+      </w:r>
+    </w:p>
+    <w:p>
+      <w:pPr>
+        <w:numPr>
+          <w:ilvl w:val="0"/>
+          <w:numId w:val="2"/>
+        </w:numPr>
+      </w:pPr>
+      <w:r>
+        <w:t xml:space="preserve">First-failure stall: inline timeout cut from 3s to 1s. A timeout is now retried by the worker immediately instead of after the 1-minute backoff, because 1 second only proves an endpoint is slow, not broken.</w:t>
+      </w:r>
+    </w:p>
+    <w:p>
+      <w:pPr>
+        <w:numPr>
+          <w:ilvl w:val="0"/>
+          <w:numId w:val="2"/>
+        </w:numPr>
+      </w:pPr>
+      <w:r>
+        <w:t xml:space="preserve">12 Kafka partitions (up from 3). migrate.js only adds partitions when the consumer group has zero lag, because adding them remaps tenants to partitions and could reorder in-flight events.</w:t>
+      </w:r>
+    </w:p>
+    <w:p>
+      <w:pPr>
+        <w:numPr>
+          <w:ilvl w:val="0"/>
+          <w:numId w:val="2"/>
+        </w:numPr>
+      </w:pPr>
+      <w:r>
+        <w:t xml:space="preserve">Retention job: archives events older than 35 days (refuses anything under the 30-day replay window), together with their ledger and finished delivery rows, then deletes them. Never touches events with a pending delivery. Dry run by default.</w:t>
+      </w:r>
+    </w:p>
+    <w:p>
+      <w:pPr>
+        <w:numPr>
+          <w:ilvl w:val="0"/>
+          <w:numId w:val="2"/>
+        </w:numPr>
+      </w:pPr>
+      <w:r>
+        <w:t xml:space="preserve">SSRF check moved into the connection's own DNS lookup. Previously a separate lookup was checked and fetch then resolved the name again: a DNS-rebinding window. Required switching from fetch to node:http, since fetch can't take a custom lookup without adding the undici package.</w:t>
+      </w:r>
+    </w:p>
+    <w:p>
+      <w:r>
+        <w:rPr>
+          <w:b/>
+          <w:bCs/>
+        </w:rPr>
+        <w:t xml:space="preserve">2. Breaker race, token bucket, per-tenant retries</w:t>
+      </w:r>
+    </w:p>
+    <w:p>
+      <w:pPr>
+        <w:numPr>
+          <w:ilvl w:val="0"/>
+          <w:numId w:val="2"/>
+        </w:numPr>
+      </w:pPr>
+      <w:r>
+        <w:t xml:space="preserve">Circuit breaker updates are now an atomic compare-and-set in Redis (a small Lua script). The state machine stays in core/, and a test fires 4 failures at the same moment and checks all 4 are counted.</w:t>
+      </w:r>
+    </w:p>
+    <w:p>
+      <w:pPr>
+        <w:numPr>
+          <w:ilvl w:val="0"/>
+          <w:numId w:val="2"/>
+        </w:numPr>
+      </w:pPr>
+      <w:r>
+        <w:t xml:space="preserve">Ingest rate limiting is now a real token bucket (one atomic Lua script using Redis's own clock, so all ingest processes share one bucket per tenant). The old fixed 1-second window let a tenant send 2x its limit across a window edge.</w:t>
+      </w:r>
+    </w:p>
+    <w:p>
+      <w:pPr>
+        <w:numPr>
+          <w:ilvl w:val="0"/>
+          <w:numId w:val="2"/>
+        </w:numPr>
+      </w:pPr>
+      <w:r>
+        <w:t xml:space="preserve">Tenants can set their own retry schedule from the dashboard (1–10 retries, 1–1440 minutes each). Rate limits are operator-only, so a tenant can't raise its own share.</w:t>
+      </w:r>
+    </w:p>
+    <w:p>
+      <w:r>
+        <w:t xml:space="preserve">Committing showed a limit of git without interactive staging: one line in consumer.js mixed two features, so the work couldn't be split cleanly by round. It was split by feature wherever the files allowed.</w:t>
+      </w:r>
+    </w:p>
+    <w:p>
+      <w:r>
+        <w:rPr>
+          <w:b/>
+          <w:bCs/>
+        </w:rPr>
+        <w:t xml:space="preserve">3. CI</w:t>
+      </w:r>
+    </w:p>
+    <w:p>
+      <w:r>
+        <w:t xml:space="preserve">GitHub Actions workflow: the 10 core unit tests run first as a fast gate; if they pass, the integration tests run against the same docker-compose stack, with test-only secrets generated per run. Checked locally by running the whole suite with .env switched off and only the workflow's variables set. Hasn't run on GitHub yet, since the repo isn't pushed.</w:t>
+      </w:r>
+    </w:p>
+    <w:p>
+      <w:r>
+        <w:rPr>
+          <w:b/>
+          <w:bCs/>
+        </w:rPr>
+        <w:t xml:space="preserve">4. Observability</w:t>
+      </w:r>
+    </w:p>
+    <w:p>
+      <w:pPr>
+        <w:numPr>
+          <w:ilvl w:val="0"/>
+          <w:numId w:val="2"/>
+        </w:numPr>
+      </w:pPr>
+      <w:r>
+        <w:t xml:space="preserve">Metrics: every process serves Prometheus metrics on an internal port (never the public dashboard port, because the numbers span tenants). Delivery attempts by outcome and tenant, accepted-to-first-attempt latency, consumer lag per partition, dead letters, pings, breaker transitions, retry distribution, plus Node CPU, memory and event-loop lag. The worker also reports live DLQ depth, backlog, oldest-pending age and each open breaker.</w:t>
+      </w:r>
+    </w:p>
+    <w:p>
+      <w:pPr>
+        <w:numPr>
+          <w:ilvl w:val="0"/>
+          <w:numId w:val="2"/>
+        </w:numPr>
+      </w:pPr>
+      <w:r>
+        <w:t xml:space="preserve">Structured logs: one JSON object per line with event_id, endpoint_id and tenant_id. A test fails if any process prints a non-JSON line.</w:t>
+      </w:r>
+    </w:p>
+    <w:p>
+      <w:pPr>
+        <w:numPr>
+          <w:ilvl w:val="0"/>
+          <w:numId w:val="2"/>
+        </w:numPr>
+      </w:pPr>
+      <w:r>
+        <w:t xml:space="preserve">Tracing (OpenTelemetry + Jaeger): one trace per event across ingest, consumer and worker. The trace context is stored on the event row as well as in Kafka headers, so a retry hours later still joins the original trace. Verified live: one event's trace contained spans from three processes.</w:t>
+      </w:r>
+    </w:p>
+    <w:p>
+      <w:pPr>
+        <w:numPr>
+          <w:ilvl w:val="0"/>
+          <w:numId w:val="2"/>
+        </w:numPr>
+      </w:pPr>
+      <w:r>
+        <w:t xml:space="preserve">Prometheus with 8 alert rules (validated with promtool, then loaded by a live Prometheus) and a 22-panel Grafana dashboard, designed with fixed status colors for outcomes, no dual axes, and tables instead of unreadable many-line charts.</w:t>
+      </w:r>
+    </w:p>
+    <w:p>
+      <w:pPr>
+        <w:numPr>
+          <w:ilvl w:val="0"/>
+          <w:numId w:val="2"/>
+        </w:numPr>
+      </w:pPr>
+      <w:r>
+        <w:t xml:space="preserve">Bug found in my own metrics: one gauge read another gauge's query result, but prom-client collects gauges concurrently, so it was always one scrape behind. Each gauge now does its own query.</w:t>
+      </w:r>
+    </w:p>
+    <w:p>
+      <w:r>
+        <w:rPr>
+          <w:b/>
+          <w:bCs/>
+        </w:rPr>
+        <w:t xml:space="preserve">5. Docker, Kubernetes and graceful shutdown</w:t>
+      </w:r>
+    </w:p>
+    <w:p>
+      <w:r>
+        <w:t xml:space="preserve">One Docker image runs all five processes (pinned Node version, non-root, production dependencies only). Kubernetes manifests via kustomize: k8s/app (Reliant itself, environment-agnostic) and k8s/local (adds in-cluster Postgres, Redis and Redpanda for a local cluster). Deployed to Docker Desktop's Kubernetes and checked end to end: an event went through the in-cluster ingest, Kafka and consumer to a receiver pod, signed, and the dashboard reported it delivered.</w:t>
+      </w:r>
+    </w:p>
+    <w:p>
+      <w:r>
+        <w:t xml:space="preserve">Real bugs that only the real deploy found:</w:t>
+      </w:r>
+    </w:p>
+    <w:p>
+      <w:pPr>
+        <w:numPr>
+          <w:ilvl w:val="0"/>
+          <w:numId w:val="2"/>
+        </w:numPr>
+      </w:pPr>
+      <w:r>
+        <w:t xml:space="preserve">Graceful shutdown never actually worked mid-delivery. Testing in Docker showed the worker ignored SIGTERM if it arrived during its first sweep: the handler was registered only after that sweep, and Node running as the container's PID 1 silently drops unhandled SIGTERM. Same ordering bug in two other processes. Fixed by registering handlers first; retest: SIGTERM 0.17s into a 3s delivery, then the delivery finished, its ledger row was written, and the process exited with code 0 after 3.2s. This had been an open item since Day 3.</w:t>
+      </w:r>
+    </w:p>
+    <w:p>
+      <w:pPr>
+        <w:numPr>
+          <w:ilvl w:val="0"/>
+          <w:numId w:val="2"/>
+        </w:numPr>
+      </w:pPr>
+      <w:r>
+        <w:t xml:space="preserve">Ingest and dashboard crash-looped with 'port NaN': Kubernetes injects Docker-link-style variables like INGEST_PORT=tcp://10.x.x.x:3000 for a Service named ingest, which overwrote the app's own INGEST_PORT. Fixed with enableServiceLinks: false on every pod.</w:t>
+      </w:r>
+    </w:p>
+    <w:p>
+      <w:pPr>
+        <w:numPr>
+          <w:ilvl w:val="0"/>
+          <w:numId w:val="2"/>
+        </w:numPr>
+      </w:pPr>
+      <w:r>
+        <w:t xml:space="preserve">The migrate Job printed endpoint signing secrets into pod logs, which a cluster collects and keeps. It now logs only which endpoint got a secret.</w:t>
+      </w:r>
+    </w:p>
+    <w:p>
+      <w:r>
+        <w:rPr>
+          <w:b/>
+          <w:bCs/>
+        </w:rPr>
+        <w:t xml:space="preserve">6. Autoscaling (ADR-006 decided)</w:t>
+      </w:r>
+    </w:p>
+    <w:p>
+      <w:r>
+        <w:t xml:space="preserve">KEDA scales the consumer on Kafka consumer-group lag (target 500 per replica, max 12 = partition count) and the worker on the number of endpoints with retry work due (not raw row count, because one worker handles one row per endpoint per sweep). CPU is the wrong signal for both: a big backlog and a busy-but-keeping-up consumer look the same on CPU.</w:t>
+      </w:r>
+    </w:p>
+    <w:p>
+      <w:r>
+        <w:t xml:space="preserve">Verified: with the consumer's CPU capped to simulate under-provisioning and a 12,000-event backlog across 30 tenants, KEDA scaled it from 1 to 4 replicas within 20 seconds, then back to 1 after the 2-minute scale-down window. Without the cap, one consumer drained the backlog before the autoscaler even took its first reading, which is itself a useful result.</w:t>
+      </w:r>
+    </w:p>
+    <w:p>
+      <w:r>
+        <w:t xml:space="preserve">Mistakes along the way:</w:t>
+      </w:r>
+    </w:p>
+    <w:p>
+      <w:pPr>
+        <w:numPr>
+          <w:ilvl w:val="0"/>
+          <w:numId w:val="2"/>
+        </w:numPr>
+      </w:pPr>
+      <w:r>
+        <w:t xml:space="preserve">KEDA's scalers run in another namespace, so short service names didn't resolve there. Fixed with fully qualified names, including Redpanda's advertised address.</w:t>
+      </w:r>
+    </w:p>
+    <w:p>
+      <w:pPr>
+        <w:numPr>
+          <w:ilvl w:val="0"/>
+          <w:numId w:val="2"/>
+        </w:numPr>
+      </w:pPr>
+      <w:r>
+        <w:t xml:space="preserve">My own mistake: changing the shared ConfigMap restarted the in-cluster Postgres and Redpanda, which have no persistence, so both were wiped. Then the migrate Job raced the Postgres restart and wrote the schema into the dying pod. Fixed: Postgres no longer reads the app ConfigMap, and the migrate Job deletes itself after finishing so the next apply re-runs it. Only local test data was lost, but it's a real lesson about stateful pods and generated config names.</w:t>
+      </w:r>
+    </w:p>
+    <w:p>
+      <w:pPr>
+        <w:numPr>
+          <w:ilvl w:val="0"/>
+          <w:numId w:val="2"/>
+        </w:numPr>
+      </w:pPr>
+      <w:r>
+        <w:t xml:space="preserve">kubectl apply was resetting the replica count the autoscaler had set. Fixed by removing the replicas field from autoscaled Deployments.</w:t>
+      </w:r>
+    </w:p>
+    <w:p>
+      <w:r>
+        <w:rPr>
+          <w:b/>
+          <w:bCs/>
+        </w:rPr>
+        <w:t xml:space="preserve">7. End-of-day state</w:t>
+      </w:r>
+    </w:p>
+    <w:p>
+      <w:r>
+        <w:t xml:space="preserve">36 tests (10 unit, 26 integration). ADRs 001, 002, 004, 005, 006, 007, 008 accepted. Running locally: Reliant on Kubernetes with KEDA autoscaling, plus Prometheus, Jaeger and Grafana via docker-compose.</w:t>
+      </w:r>
+    </w:p>
+    <w:p>
+      <w:r>
+        <w:rPr>
+          <w:b/>
+          <w:bCs/>
+        </w:rPr>
+        <w:t xml:space="preserve">8. What's left</w:t>
+      </w:r>
+    </w:p>
+    <w:p>
+      <w:pPr>
+        <w:numPr>
+          <w:ilvl w:val="0"/>
+          <w:numId w:val="2"/>
+        </w:numPr>
+      </w:pPr>
+      <w:r>
+        <w:t xml:space="preserve">Push to GitHub (turns CI on).</w:t>
+      </w:r>
+    </w:p>
+    <w:p>
+      <w:pPr>
+        <w:numPr>
+          <w:ilvl w:val="0"/>
+          <w:numId w:val="2"/>
+        </w:numPr>
+      </w:pPr>
+      <w:r>
+        <w:t xml:space="preserve">Terraform and AWS (EKS, RDS, ElastiCache, MSK), plus ADR-003 (managed vs self-hosted Kafka) and a CPU autoscaler for ingest; the only part that costs money.</w:t>
+      </w:r>
+    </w:p>
+    <w:p>
+      <w:pPr>
+        <w:numPr>
+          <w:ilvl w:val="0"/>
+          <w:numId w:val="2"/>
+        </w:numPr>
+      </w:pPr>
+      <w:r>
+        <w:t xml:space="preserve">One induced-failure postmortem (spec Phase 4).</w:t>
+      </w:r>
+    </w:p>
+    <w:p>
+      <w:pPr>
+        <w:numPr>
+          <w:ilvl w:val="0"/>
+          <w:numId w:val="2"/>
+        </w:numPr>
+      </w:pPr>
+      <w:r>
+        <w:t xml:space="preserve">Retention as a CronJob, once archives go to S3 instead of local files.</w:t>
       </w:r>
     </w:p>
     <w:sectPr>

</xml_diff>

<commit_message>
Progression report: Day 6
Co-Authored-By: Claude Opus 5.5 <noreply@anthropic.com>
</commit_message>
<xml_diff>
--- a/Progression report.docx
+++ b/Progression report.docx
@@ -1731,6 +1731,474 @@
       </w:pPr>
       <w:r>
         <w:t xml:space="preserve">Retention as a CronJob, once archives go to S3 instead of local files.</w:t>
+      </w:r>
+    </w:p>
+    <w:p>
+      <w:r>
+        <w:rPr>
+          <w:b/>
+          <w:bCs/>
+        </w:rPr>
+        <w:t xml:space="preserve">Day 6:</w:t>
+      </w:r>
+    </w:p>
+    <w:p>
+      <w:r>
+        <w:t xml:space="preserve">Goal for today: prove the failure handling with induced outages, push to GitHub, get the design reviewed, then close the gaps the review and my own list raised: AWS pieces that can be checked for free, dashboard sign-in, a receiver SDK, and a second round of failure drills. As before, Claude Code did most of the implementation while I directed and reviewed. The day ran from late on Day 5 into Day 6: 9 commits, all pushed.</w:t>
+      </w:r>
+    </w:p>
+    <w:p>
+      <w:r>
+        <w:rPr>
+          <w:b/>
+          <w:bCs/>
+        </w:rPr>
+        <w:t xml:space="preserve">1. Induced-failure drills and incident reports</w:t>
+      </w:r>
+    </w:p>
+    <w:p>
+      <w:r>
+        <w:t xml:space="preserve">Each drill kills a dependency mid-traffic and checks at the receiver that every accepted event still arrives. Four postmortems are in production/incident-reports/.</w:t>
+      </w:r>
+    </w:p>
+    <w:p>
+      <w:pPr>
+        <w:numPr>
+          <w:ilvl w:val="0"/>
+          <w:numId w:val="2"/>
+        </w:numPr>
+      </w:pPr>
+      <w:r>
+        <w:t xml:space="preserve">001 Postgres restart: an unhandled pg.Pool 'error' event killed every process at once, and a /metrics scrape during the outage crashed the worker. Fixed with a pool error handler, a connect timeout, and ingest answering 503 + Retry-After while storage is down.</w:t>
+      </w:r>
+    </w:p>
+    <w:p>
+      <w:pPr>
+        <w:numPr>
+          <w:ilvl w:val="0"/>
+          <w:numId w:val="2"/>
+        </w:numPr>
+      </w:pPr>
+      <w:r>
+        <w:t xml:space="preserve">002 Redis outage: the Redis client queued commands while offline, so the code paths meant to fail open hung instead; the worker also drained only one event per endpoint per poll. All fixed.</w:t>
+      </w:r>
+    </w:p>
+    <w:p>
+      <w:pPr>
+        <w:numPr>
+          <w:ilvl w:val="0"/>
+          <w:numId w:val="2"/>
+        </w:numPr>
+      </w:pPr>
+      <w:r>
+        <w:t xml:space="preserve">003 Redpanda outage: ingest hung about 35s per request. Publishes are now bounded at 3s.</w:t>
+      </w:r>
+    </w:p>
+    <w:p>
+      <w:pPr>
+        <w:numPr>
+          <w:ilvl w:val="0"/>
+          <w:numId w:val="2"/>
+        </w:numPr>
+      </w:pPr>
+      <w:r>
+        <w:t xml:space="preserve">004 Zombie consumer: a consumer frozen past the session timeout came back and re-delivered about 137 events per run that another consumer had already delivered. It now checks its group membership before each inline attempt and before writing, which cut that to 0–1.</w:t>
+      </w:r>
+    </w:p>
+    <w:p>
+      <w:r>
+        <w:t xml:space="preserve">Also finished: subscriptions (an endpoint can choose which event types it receives), a monthly-partitioned ledger, and the recovery benchmark at the spec's size (a 600,000-event backlog drained in 139s with no duplicates).</w:t>
+      </w:r>
+    </w:p>
+    <w:p>
+      <w:r>
+        <w:rPr>
+          <w:b/>
+          <w:bCs/>
+        </w:rPr>
+        <w:t xml:space="preserve">2. Pushed to GitHub, design doc, outside review</w:t>
+      </w:r>
+    </w:p>
+    <w:p>
+      <w:r>
+        <w:t xml:space="preserve">The repo is on GitHub, which turned CI on. I wrote a design doc that walks through every requirement in the spec and how it was met, with an architecture diagram, and asked others to review it. The review held up and found real problems:</w:t>
+      </w:r>
+    </w:p>
+    <w:p>
+      <w:pPr>
+        <w:numPr>
+          <w:ilvl w:val="0"/>
+          <w:numId w:val="2"/>
+        </w:numPr>
+      </w:pPr>
+      <w:r>
+        <w:t xml:space="preserve">Redpanda acknowledged writes before they reached disk (write caching on), so an accepted event could be lost in a broker crash. Turned off.</w:t>
+      </w:r>
+    </w:p>
+    <w:p>
+      <w:pPr>
+        <w:numPr>
+          <w:ilvl w:val="0"/>
+          <w:numId w:val="2"/>
+        </w:numPr>
+      </w:pPr>
+      <w:r>
+        <w:t xml:space="preserve">Worker leases didn't fence: a worker that stalled past its 60s lease could overwrite the new owner's result. Every write now requires the claim's lease token, with a test that fails if the check is removed.</w:t>
+      </w:r>
+    </w:p>
+    <w:p>
+      <w:pPr>
+        <w:numPr>
+          <w:ilvl w:val="0"/>
+          <w:numId w:val="2"/>
+        </w:numPr>
+      </w:pPr>
+      <w:r>
+        <w:t xml:space="preserve">Nothing checked accepted events at runtime. A reconciler now finds events 15–60 minutes old with no outcome and re-sends them, with two new alerts.</w:t>
+      </w:r>
+    </w:p>
+    <w:p>
+      <w:pPr>
+        <w:numPr>
+          <w:ilvl w:val="0"/>
+          <w:numId w:val="2"/>
+        </w:numPr>
+      </w:pPr>
+      <w:r>
+        <w:t xml:space="preserve">About five places where the doc claimed more than the code does. All corrected.</w:t>
+      </w:r>
+    </w:p>
+    <w:p>
+      <w:r>
+        <w:t xml:space="preserve">I also wrote a blog post on the zombie-consumer bug and a short LinkedIn draft, using only numbers from the repo.</w:t>
+      </w:r>
+    </w:p>
+    <w:p>
+      <w:r>
+        <w:rPr>
+          <w:b/>
+          <w:bCs/>
+        </w:rPr>
+        <w:t xml:space="preserve">3. Receiver SDK and Standard Webhooks</w:t>
+      </w:r>
+    </w:p>
+    <w:p>
+      <w:r>
+        <w:t xml:space="preserve">A Python receiver SDK (standard library only): it verifies signatures, accepts either secret during a rotation, rejects stale timestamps and deduplicates on webhook-id. Building it showed that Reliant wasn't actually Standard Webhooks compatible: it used the whole whsec_ string as the HMAC key instead of decoding it. Fixed before anyone integrated, and checked against the official standardwebhooks library in both directions in CI.</w:t>
+      </w:r>
+    </w:p>
+    <w:p>
+      <w:r>
+        <w:rPr>
+          <w:b/>
+          <w:bCs/>
+        </w:rPr>
+        <w:t xml:space="preserve">4. AWS without spending money</w:t>
+      </w:r>
+    </w:p>
+    <w:p>
+      <w:pPr>
+        <w:numPr>
+          <w:ilvl w:val="0"/>
+          <w:numId w:val="2"/>
+        </w:numPr>
+      </w:pPr>
+      <w:r>
+        <w:t xml:space="preserve">KMS envelope encryption for endpoint signing secrets, and retention archives to S3, both tested against LocalStack (a local AWS emulator).</w:t>
+      </w:r>
+    </w:p>
+    <w:p>
+      <w:pPr>
+        <w:numPr>
+          <w:ilvl w:val="0"/>
+          <w:numId w:val="2"/>
+        </w:numPr>
+      </w:pPr>
+      <w:r>
+        <w:t xml:space="preserve">Terraform for the whole AWS stack (VPC, EKS, RDS, ElastiCache, MSK, KMS, S3, IAM): 100 resources that pass validate and plan against LocalStack. Never applied to a real account. ADR-003 records the choice of managed MSK over Kafka on Kubernetes.</w:t>
+      </w:r>
+    </w:p>
+    <w:p>
+      <w:pPr>
+        <w:numPr>
+          <w:ilvl w:val="0"/>
+          <w:numId w:val="2"/>
+        </w:numPr>
+      </w:pPr>
+      <w:r>
+        <w:t xml:space="preserve">My mistake: running migrate with the KMS settings re-encrypted the dev database's secrets under a LocalStack key that disappears when LocalStack restarts. Restored them, scoped the re-encryption step and added warnings.</w:t>
+      </w:r>
+    </w:p>
+    <w:p>
+      <w:r>
+        <w:rPr>
+          <w:b/>
+          <w:bCs/>
+        </w:rPr>
+        <w:t xml:space="preserve">5. Dashboard sign-in</w:t>
+      </w:r>
+    </w:p>
+    <w:p>
+      <w:r>
+        <w:t xml:space="preserve">People now sign in with email and password, as an owner (full control) or a viewer (read-only); API keys keep working for scripts. Passwords use scrypt, sessions are random tokens stored only as a hash, the cookie is HttpOnly, SameSite=Strict and Secure, every cookie-authenticated change must come from the dashboard's own page, and logins are rate-limited per email and per IP. A tenant can never lose its last owner. 9 integration tests, plus a 13-step check in a real headless browser.</w:t>
+      </w:r>
+    </w:p>
+    <w:p>
+      <w:r>
+        <w:rPr>
+          <w:b/>
+          <w:bCs/>
+        </w:rPr>
+        <w:t xml:space="preserve">6. Review round 2: status codes and dead endpoints</w:t>
+      </w:r>
+    </w:p>
+    <w:p>
+      <w:pPr>
+        <w:numPr>
+          <w:ilvl w:val="0"/>
+          <w:numId w:val="2"/>
+        </w:numPr>
+      </w:pPr>
+      <w:r>
+        <w:t xml:space="preserve">429 or 503 with Retry-After: the next try waits as long as the receiver asked.</w:t>
+      </w:r>
+    </w:p>
+    <w:p>
+      <w:pPr>
+        <w:numPr>
+          <w:ilvl w:val="0"/>
+          <w:numId w:val="2"/>
+        </w:numPr>
+      </w:pPr>
+      <w:r>
+        <w:t xml:space="preserve">410 Gone: Reliant turns the endpoint off and dead-letters what was queued for it; an owner turns it back on and replays.</w:t>
+      </w:r>
+    </w:p>
+    <w:p>
+      <w:pPr>
+        <w:numPr>
+          <w:ilvl w:val="0"/>
+          <w:numId w:val="2"/>
+        </w:numPr>
+      </w:pPr>
+      <w:r>
+        <w:t xml:space="preserve">A dead endpoint's backlog: when its oldest event runs out of retries, everything queued behind it goes to the dead-letter queue too. Before, 100 queued events took about 100 × 14.6 hours to get there; now none waits more than one retry cycle. Recorded in ADR-009.</w:t>
+      </w:r>
+    </w:p>
+    <w:p>
+      <w:r>
+        <w:rPr>
+          <w:b/>
+          <w:bCs/>
+        </w:rPr>
+        <w:t xml:space="preserve">7. Files for running it live</w:t>
+      </w:r>
+    </w:p>
+    <w:p>
+      <w:r>
+        <w:t xml:space="preserve">A single-VM setup (deploy/): docker compose behind Caddy for automatic HTTPS, with a demo receiver. Rehearsing it locally found a real security hole: schema.sql created the two dev tenants everywhere migrate ran, including the AWS setup, and their API keys are published in the repo. They're now created only when DEV_SEED=true, and a create-tenant command makes real ones. It also found that Caddy wouldn't start with the email setting left blank. Not yet run on a real VM.</w:t>
+      </w:r>
+    </w:p>
+    <w:p>
+      <w:r>
+        <w:rPr>
+          <w:b/>
+          <w:bCs/>
+        </w:rPr>
+        <w:t xml:space="preserve">8. Round 2 failure drills</w:t>
+      </w:r>
+    </w:p>
+    <w:p>
+      <w:r>
+        <w:t xml:space="preserve">Five more drills, all re-runnable from loadtest/. None lost an event or broke per-endpoint order.</w:t>
+      </w:r>
+    </w:p>
+    <w:p>
+      <w:pPr>
+        <w:numPr>
+          <w:ilvl w:val="0"/>
+          <w:numId w:val="2"/>
+        </w:numPr>
+      </w:pPr>
+      <w:r>
+        <w:t xml:space="preserve">Redis down while every tenant also has a hanging endpoint: no duplicates, and healthy endpoints didn't slow down.</w:t>
+      </w:r>
+    </w:p>
+    <w:p>
+      <w:pPr>
+        <w:numPr>
+          <w:ilvl w:val="0"/>
+          <w:numId w:val="2"/>
+        </w:numPr>
+      </w:pPr>
+      <w:r>
+        <w:t xml:space="preserve">A worker frozen longer than its lease: the new owner delivered everything; the frozen worker's 20 writes were all refused by the lease check. Each event arrived twice, which is the expected cost.</w:t>
+      </w:r>
+    </w:p>
+    <w:p>
+      <w:pPr>
+        <w:numPr>
+          <w:ilvl w:val="0"/>
+          <w:numId w:val="2"/>
+        </w:numPr>
+      </w:pPr>
+      <w:r>
+        <w:t xml:space="preserve">A consumer cut off from Kafka while still running: 1 duplicate, and it rejoined 19.5s after the network came back.</w:t>
+      </w:r>
+    </w:p>
+    <w:p>
+      <w:pPr>
+        <w:numPr>
+          <w:ilvl w:val="0"/>
+          <w:numId w:val="2"/>
+        </w:numPr>
+      </w:pPr>
+      <w:r>
+        <w:t xml:space="preserve">KEDA scale-out under live load: 1 to 2 consumers with no losses or duplicates.</w:t>
+      </w:r>
+    </w:p>
+    <w:p>
+      <w:pPr>
+        <w:numPr>
+          <w:ilvl w:val="0"/>
+          <w:numId w:val="2"/>
+        </w:numPr>
+      </w:pPr>
+      <w:r>
+        <w:t xml:space="preserve">A rolling consumer restart at about 1,000 events/s: no losses, but latency (p95) stayed at 11–38s for the rest of the load. See section 9.</w:t>
+      </w:r>
+    </w:p>
+    <w:p>
+      <w:r>
+        <w:t xml:space="preserve">Several early drill results were wrong because of bugs in my test tooling, not in Reliant: Windows ran out of network ports at 1,000/s, synchronous kubectl calls blocked the test receiver, and the order check counted concurrent requests (which have no order) as reordering, about 9,000 false alarms.</w:t>
+      </w:r>
+    </w:p>
+    <w:p>
+      <w:r>
+        <w:rPr>
+          <w:b/>
+          <w:bCs/>
+        </w:rPr>
+        <w:t xml:space="preserve">9. The slow recovery, found and fixed</w:t>
+      </w:r>
+    </w:p>
+    <w:p>
+      <w:r>
+        <w:t xml:space="preserve">The cause was the retry worker. It drained one event per endpoint per pass, waited for the slowest endpoint each pass, and made two database writes per event: about 10 events/s per endpoint, no faster than they were arriving, so pushed-back endpoints never caught up. It now sends up to 20 of an endpoint's queued events in a row (still one at a time, in order), saves each batch in three writes, and never waits on a slower endpoint.</w:t>
+      </w:r>
+    </w:p>
+    <w:p>
+      <w:pPr>
+        <w:numPr>
+          <w:ilvl w:val="0"/>
+          <w:numId w:val="2"/>
+        </w:numPr>
+      </w:pPr>
+      <w:r>
+        <w:t xml:space="preserve">Measured with a new benchmark, 3 runs each: about 10 → 30 events/s per endpoint.</w:t>
+      </w:r>
+    </w:p>
+    <w:p>
+      <w:pPr>
+        <w:numPr>
+          <w:ilvl w:val="0"/>
+          <w:numId w:val="2"/>
+        </w:numPr>
+      </w:pPr>
+      <w:r>
+        <w:t xml:space="preserve">In the drill: p95 back under 150ms within 15–35s of the restart, against 11–38s that never recovered before.</w:t>
+      </w:r>
+    </w:p>
+    <w:p>
+      <w:pPr>
+        <w:numPr>
+          <w:ilvl w:val="0"/>
+          <w:numId w:val="2"/>
+        </w:numPr>
+      </w:pPr>
+      <w:r>
+        <w:t xml:space="preserve">A first fix (a per-endpoint loop with per-row writes) made the drill worse in a side-by-side run, so I reverted it before finding the real cost.</w:t>
+      </w:r>
+    </w:p>
+    <w:p>
+      <w:r>
+        <w:rPr>
+          <w:b/>
+          <w:bCs/>
+        </w:rPr>
+        <w:t xml:space="preserve">10. CI had been failing since the KMS commit</w:t>
+      </w:r>
+    </w:p>
+    <w:p>
+      <w:r>
+        <w:t xml:space="preserve">CI was red from the KMS commit onward, four pushes in a row, and I only noticed when I looked at the Actions page. LocalStack only runs an init script that is executable; Git on Windows committed it as not executable, while Docker Desktop on Windows treats every mounted file as executable, which is why it worked locally. So in CI LocalStack never finished setting up, and the integration and Terraform jobs failed. Reproduced in a fresh container, fixed, and CI is green again. Lesson: check CI after every push, not just local tests.</w:t>
+      </w:r>
+    </w:p>
+    <w:p>
+      <w:r>
+        <w:rPr>
+          <w:b/>
+          <w:bCs/>
+        </w:rPr>
+        <w:t xml:space="preserve">11. End-of-day state</w:t>
+      </w:r>
+    </w:p>
+    <w:p>
+      <w:r>
+        <w:t xml:space="preserve">9 commits since Day 5, all on GitHub, CI green. Tests: 15 unit, 48 integration (plus 4 AWS tests that need LocalStack), 24 for the Python SDK. ADRs 001–009 accepted. Docs added today: the design doc, docs/drills.md, 4 incident reports, the blog post. The local Kubernetes cluster runs the latest code.</w:t>
+      </w:r>
+    </w:p>
+    <w:p>
+      <w:r>
+        <w:rPr>
+          <w:b/>
+          <w:bCs/>
+        </w:rPr>
+        <w:t xml:space="preserve">12. What's left</w:t>
+      </w:r>
+    </w:p>
+    <w:p>
+      <w:pPr>
+        <w:numPr>
+          <w:ilvl w:val="0"/>
+          <w:numId w:val="2"/>
+        </w:numPr>
+      </w:pPr>
+      <w:r>
+        <w:t xml:space="preserve">Run the live setup on a real VM (Oracle Cloud's free tier would cost nothing).</w:t>
+      </w:r>
+    </w:p>
+    <w:p>
+      <w:pPr>
+        <w:numPr>
+          <w:ilvl w:val="0"/>
+          <w:numId w:val="2"/>
+        </w:numPr>
+      </w:pPr>
+      <w:r>
+        <w:t xml:space="preserve">Real AWS: everything is written and checked, never applied, because it costs money.</w:t>
+      </w:r>
+    </w:p>
+    <w:p>
+      <w:pPr>
+        <w:numPr>
+          <w:ilvl w:val="0"/>
+          <w:numId w:val="2"/>
+        </w:numPr>
+      </w:pPr>
+      <w:r>
+        <w:t xml:space="preserve">One ingest token per producer instead of one shared token; password reset, SSO and two-factor sign-in.</w:t>
+      </w:r>
+    </w:p>
+    <w:p>
+      <w:pPr>
+        <w:numPr>
+          <w:ilvl w:val="0"/>
+          <w:numId w:val="2"/>
+        </w:numPr>
+      </w:pPr>
+      <w:r>
+        <w:t xml:space="preserve">Drills not yet done: losing one of several Kafka brokers, and a worker cut off from Postgres while still running. Also a small known inaccuracy: a frozen worker records its in-flight attempts as timeouts even when the receiver answered 200.</w:t>
       </w:r>
     </w:p>
     <w:sectPr>

</xml_diff>

<commit_message>
Progression report: Day 6 live deploy via Cloudflare tunnel
Co-Authored-By: Claude Opus 5.5 <noreply@anthropic.com>
</commit_message>
<xml_diff>
--- a/Progression report.docx
+++ b/Progression report.docx
@@ -2001,6 +2001,44 @@
     </w:p>
     <w:p>
       <w:r>
+        <w:t xml:space="preserve">Then I put it live. Oracle's free tier needs a Visa or Mastercard to verify an account, my debit card is RuPay (which none of the big clouds accept), and Azure for Students didn't work for me either. So Reliant now runs from this laptop behind a free Cloudflare quick tunnel (deploy/compose.tunnel.yaml): a public HTTPS address, no account, and no ports open on the laptop. Caddy takes each visitor's real IP from Cloudflare's header, so the per-IP login limit still works.</w:t>
+      </w:r>
+    </w:p>
+    <w:p>
+      <w:pPr>
+        <w:numPr>
+          <w:ilvl w:val="0"/>
+          <w:numId w:val="2"/>
+        </w:numPr>
+      </w:pPr>
+      <w:r>
+        <w:t xml:space="preserve">Checked through the public address, 12 checks: sign-in, the published dev key refused, internal addresses refused as endpoints, and a signed event delivered over the internet to the demo receiver.</w:t>
+      </w:r>
+    </w:p>
+    <w:p>
+      <w:pPr>
+        <w:numPr>
+          <w:ilvl w:val="0"/>
+          <w:numId w:val="2"/>
+        </w:numPr>
+      </w:pPr>
+      <w:r>
+        <w:t xml:space="preserve">Outage demo: with the receiver stopped, I sent two events. Both were accepted; the first failed twice and waited for its retry, and the second was never tried, queued behind it. When the receiver came back, both arrived in order, once each.</w:t>
+      </w:r>
+    </w:p>
+    <w:p>
+      <w:pPr>
+        <w:numPr>
+          <w:ilvl w:val="0"/>
+          <w:numId w:val="2"/>
+        </w:numPr>
+      </w:pPr>
+      <w:r>
+        <w:t xml:space="preserve">Limits: it's only live while the laptop is on, and the address changes whenever the tunnel restarts.</w:t>
+      </w:r>
+    </w:p>
+    <w:p>
+      <w:r>
         <w:rPr>
           <w:b/>
           <w:bCs/>
@@ -2145,7 +2183,7 @@
     </w:p>
     <w:p>
       <w:r>
-        <w:t xml:space="preserve">9 commits since Day 5, all on GitHub, CI green. Tests: 15 unit, 48 integration (plus 4 AWS tests that need LocalStack), 24 for the Python SDK. ADRs 001–009 accepted. Docs added today: the design doc, docs/drills.md, 4 incident reports, the blog post. The local Kubernetes cluster runs the latest code.</w:t>
+        <w:t xml:space="preserve">11 commits since Day 5, all on GitHub, CI green. Reliant is live on the internet from this laptop. Tests: 15 unit, 48 integration (plus 4 AWS tests that need LocalStack), 24 for the Python SDK. ADRs 001–009 accepted. Docs added today: the design doc, docs/drills.md, 4 incident reports, the blog post. The local Kubernetes cluster runs the latest code.</w:t>
       </w:r>
     </w:p>
     <w:p>
@@ -2165,7 +2203,7 @@
         </w:numPr>
       </w:pPr>
       <w:r>
-        <w:t xml:space="preserve">Run the live setup on a real VM (Oracle Cloud's free tier would cost nothing).</w:t>
+        <w:t xml:space="preserve">Move the live setup to an always-on server: Oracle's free tier needs a Visa or Mastercard, which a virtual card from my bank would cover.</w:t>
       </w:r>
     </w:p>
     <w:p>

</xml_diff>

<commit_message>
Progression report: Day 6 monitoring for every environment
Co-Authored-By: Claude Opus 5.5 <noreply@anthropic.com>
</commit_message>
<xml_diff>
--- a/Progression report.docx
+++ b/Progression report.docx
@@ -2178,21 +2178,95 @@
           <w:b/>
           <w:bCs/>
         </w:rPr>
-        <w:t xml:space="preserve">11. End-of-day state</w:t>
-      </w:r>
-    </w:p>
-    <w:p>
-      <w:r>
-        <w:t xml:space="preserve">11 commits since Day 5, all on GitHub, CI green. Reliant is live on the internet from this laptop. Tests: 15 unit, 48 integration (plus 4 AWS tests that need LocalStack), 24 for the Python SDK. ADRs 001–009 accepted. Docs added today: the design doc, docs/drills.md, 4 incident reports, the blog post. The local Kubernetes cluster runs the latest code.</w:t>
-      </w:r>
-    </w:p>
-    <w:p>
-      <w:r>
-        <w:rPr>
-          <w:b/>
-          <w:bCs/>
-        </w:rPr>
-        <w:t xml:space="preserve">12. What's left</w:t>
+        <w:t xml:space="preserve">11. Monitoring for every environment</w:t>
+      </w:r>
+    </w:p>
+    <w:p>
+      <w:r>
+        <w:t xml:space="preserve">Checking that all the metrics were up to date showed four from today (lease losses, unaccounted events, reconciler re-sends, endpoints disabled after a 410) were recorded but shown nowhere, and that only Reliant running directly on this laptop was monitored at all. Now:</w:t>
+      </w:r>
+    </w:p>
+    <w:p>
+      <w:pPr>
+        <w:numPr>
+          <w:ilvl w:val="0"/>
+          <w:numId w:val="2"/>
+        </w:numPr>
+      </w:pPr>
+      <w:r>
+        <w:t xml:space="preserve">The Grafana dashboard has a new "Fencing and recovery" row for those four, the two new dead-letter reasons in colours checked for colour-blindness and contrast, and a new alert when an endpoint is disabled (12 rules).</w:t>
+      </w:r>
+    </w:p>
+    <w:p>
+      <w:pPr>
+        <w:numPr>
+          <w:ilvl w:val="0"/>
+          <w:numId w:val="2"/>
+        </w:numPr>
+      </w:pPr>
+      <w:r>
+        <w:t xml:space="preserve">Kubernetes: a Prometheus runs inside the cluster, finds every Reliant pod by itself, and uses the same alert rules. It's only allowed to list pods in the reliant namespace. The local Grafana reads it as a second data source.</w:t>
+      </w:r>
+    </w:p>
+    <w:p>
+      <w:pPr>
+        <w:numPr>
+          <w:ilvl w:val="0"/>
+          <w:numId w:val="2"/>
+        </w:numPr>
+      </w:pPr>
+      <w:r>
+        <w:t xml:space="preserve">Live stack: its own Prometheus and Grafana. Grafana is only reachable from this machine, needs a password, and can't be reached through the public tunnel address.</w:t>
+      </w:r>
+    </w:p>
+    <w:p>
+      <w:pPr>
+        <w:numPr>
+          <w:ilvl w:val="0"/>
+          <w:numId w:val="2"/>
+        </w:numPr>
+      </w:pPr>
+      <w:r>
+        <w:t xml:space="preserve">One dashboard for all three, with a picker at the top. A screenshot of the Kubernetes view showed the 2 ingest pods as two identical lines, so those panels now show one line per process.</w:t>
+      </w:r>
+    </w:p>
+    <w:p>
+      <w:pPr>
+        <w:numPr>
+          <w:ilvl w:val="0"/>
+          <w:numId w:val="2"/>
+        </w:numPr>
+      </w:pPr>
+      <w:r>
+        <w:t xml:space="preserve">CI now checks all three Prometheus configs and the alert rules on every push.</w:t>
+      </w:r>
+    </w:p>
+    <w:p>
+      <w:r>
+        <w:t xml:space="preserve">Alerts show on screen but aren't sent anywhere yet: that needs an Alertmanager with an email or Slack destination.</w:t>
+      </w:r>
+    </w:p>
+    <w:p>
+      <w:r>
+        <w:rPr>
+          <w:b/>
+          <w:bCs/>
+        </w:rPr>
+        <w:t xml:space="preserve">12. End-of-day state</w:t>
+      </w:r>
+    </w:p>
+    <w:p>
+      <w:r>
+        <w:t xml:space="preserve">13 commits since Day 5, all on GitHub, CI green. Reliant is live on the internet from this laptop, and all three environments (local, Kubernetes, live) are monitored. Tests: 15 unit, 48 integration (plus 4 AWS tests that need LocalStack), 24 for the Python SDK. ADRs 001–009 accepted. Docs added today: the design doc, docs/drills.md, 4 incident reports, the blog post. The local Kubernetes cluster runs the latest code.</w:t>
+      </w:r>
+    </w:p>
+    <w:p>
+      <w:r>
+        <w:rPr>
+          <w:b/>
+          <w:bCs/>
+        </w:rPr>
+        <w:t xml:space="preserve">13. What's left</w:t>
       </w:r>
     </w:p>
     <w:p>
@@ -2226,6 +2300,17 @@
       </w:pPr>
       <w:r>
         <w:t xml:space="preserve">One ingest token per producer instead of one shared token; password reset, SSO and two-factor sign-in.</w:t>
+      </w:r>
+    </w:p>
+    <w:p>
+      <w:pPr>
+        <w:numPr>
+          <w:ilvl w:val="0"/>
+          <w:numId w:val="2"/>
+        </w:numPr>
+      </w:pPr>
+      <w:r>
+        <w:t xml:space="preserve">Send alerts somewhere: an Alertmanager with an email or Slack destination.</w:t>
       </w:r>
     </w:p>
     <w:p>

</xml_diff>